<commit_message>
fix(word-export): match official form layout
</commit_message>
<xml_diff>
--- a/src/modules/word-export/templates/phieu-du-tuyen-v1.docx
+++ b/src/modules/word-export/templates/phieu-du-tuyen-v1.docx
@@ -427,9 +427,8 @@
       <w:r>
         <w:rPr>
           <w:color w:val="FF0000"/>
-          <w:sz w:val="14"/>
-          <w:szCs w:val="14"/>
-          <w:u w:val="single"/>
+          <w:sz w:val="20"/>
+          <w:szCs w:val="20"/>
         </w:rPr>
         <w:t xml:space="preserve">{major_name}</w:t>
       </w:r>
@@ -464,24 +463,7 @@
           <w:sz w:val="20"/>
           <w:szCs w:val="20"/>
         </w:rPr>
-        <w:t xml:space="preserve">Đối tượng: từ (</w:t>
-      </w:r>
-      <w:r>
-        <w:rPr>
-          <w:color w:val="FF0000"/>
-          <w:sz w:val="16"/>
-          <w:szCs w:val="16"/>
-          <w:u w:val="single"/>
-        </w:rPr>
-        <w:t xml:space="preserve">{entry_qualification}</w:t>
-      </w:r>
-      <w:r>
-        <w:rPr>
-          <w:color w:val="FF0000"/>
-          <w:sz w:val="20"/>
-          <w:szCs w:val="20"/>
-        </w:rPr>
-        <w:t xml:space="preserve">) học lên Đại học</w:t>
+        <w:t xml:space="preserve">Đối tượng: từ (THPT/TC/CĐ/ĐH).....................học lên Đại học</w:t>
       </w:r>
     </w:p>
     <w:p>
@@ -540,7 +522,7 @@
     <w:p>
       <w:pPr>
         <w:tabs>
-          <w:tab w:val="right" w:leader="dot" w:pos="-2340"/>
+          <w:tab w:val="left" w:leader="dot" w:pos="6000"/>
           <w:tab w:val="left" w:leader="dot" w:pos="9072"/>
         </w:tabs>
         <w:spacing w:before="40" w:after="40" w:line="288" w:lineRule="auto"/>
@@ -562,33 +544,38 @@
       <w:r>
         <w:rPr>
           <w:color w:val="0000FF"/>
-          <w:sz w:val="16"/>
-          <w:szCs w:val="16"/>
-          <w:u w:val="single"/>
+          <w:sz w:val="20"/>
+          <w:szCs w:val="20"/>
         </w:rPr>
         <w:t xml:space="preserve">{full_name}</w:t>
       </w:r>
       <w:r>
-        <w:rPr>
-          <w:color w:val="0000FF"/>
-          <w:sz w:val="20"/>
-          <w:szCs w:val="20"/>
-        </w:rPr>
-        <w:t xml:space="preserve">    Giới tính: </w:t>
-      </w:r>
-      <w:r>
-        <w:rPr>
-          <w:color w:val="0000FF"/>
-          <w:sz w:val="16"/>
-          <w:szCs w:val="16"/>
-          <w:u w:val="single"/>
+        <w:tab/>
+      </w:r>
+      <w:r>
+        <w:rPr>
+          <w:color w:val="0000FF"/>
+          <w:sz w:val="20"/>
+          <w:szCs w:val="20"/>
+        </w:rPr>
+        <w:t xml:space="preserve">Giới tính: </w:t>
+      </w:r>
+      <w:r>
+        <w:rPr>
+          <w:color w:val="0000FF"/>
+          <w:sz w:val="20"/>
+          <w:szCs w:val="20"/>
         </w:rPr>
         <w:t xml:space="preserve">{gender}</w:t>
       </w:r>
-    </w:p>
-    <w:p>
-      <w:pPr>
-        <w:tabs>
+      <w:r>
+        <w:tab/>
+      </w:r>
+    </w:p>
+    <w:p>
+      <w:pPr>
+        <w:tabs>
+          <w:tab w:val="left" w:leader="dot" w:pos="3600"/>
           <w:tab w:val="left" w:leader="dot" w:pos="9072"/>
         </w:tabs>
         <w:spacing w:before="40" w:after="40" w:line="288" w:lineRule="auto"/>
@@ -610,36 +597,40 @@
       <w:r>
         <w:rPr>
           <w:color w:val="0000FF"/>
-          <w:sz w:val="16"/>
-          <w:szCs w:val="16"/>
-          <w:u w:val="single"/>
+          <w:sz w:val="20"/>
+          <w:szCs w:val="20"/>
         </w:rPr>
         <w:t xml:space="preserve">{date_of_birth}</w:t>
       </w:r>
       <w:r>
-        <w:rPr>
-          <w:color w:val="0000FF"/>
-          <w:sz w:val="20"/>
-          <w:szCs w:val="20"/>
-        </w:rPr>
-        <w:t xml:space="preserve">    Nơi sinh: </w:t>
-      </w:r>
-      <w:r>
-        <w:rPr>
-          <w:color w:val="0000FF"/>
-          <w:sz w:val="16"/>
-          <w:szCs w:val="16"/>
-          <w:u w:val="single"/>
+        <w:tab/>
+      </w:r>
+      <w:r>
+        <w:rPr>
+          <w:color w:val="0000FF"/>
+          <w:sz w:val="20"/>
+          <w:szCs w:val="20"/>
+        </w:rPr>
+        <w:t xml:space="preserve">Nơi sinh: </w:t>
+      </w:r>
+      <w:r>
+        <w:rPr>
+          <w:color w:val="0000FF"/>
+          <w:sz w:val="20"/>
+          <w:szCs w:val="20"/>
         </w:rPr>
         <w:t xml:space="preserve">{place_of_birth}</w:t>
       </w:r>
-    </w:p>
-    <w:p>
-      <w:pPr>
-        <w:tabs>
+      <w:r>
+        <w:tab/>
+      </w:r>
+    </w:p>
+    <w:p>
+      <w:pPr>
+        <w:tabs>
+          <w:tab w:val="left" w:leader="dot" w:pos="3000"/>
+          <w:tab w:val="left" w:leader="dot" w:pos="6200"/>
           <w:tab w:val="left" w:leader="dot" w:pos="9072"/>
-          <w:tab w:val="right" w:leader="dot" w:pos="9120"/>
-          <w:tab w:val="left" w:pos="9214"/>
         </w:tabs>
         <w:spacing w:before="40" w:after="40" w:line="288" w:lineRule="auto"/>
         <w:ind w:right="114" w:firstLine="284"/>
@@ -660,51 +651,58 @@
       <w:r>
         <w:rPr>
           <w:color w:val="0000FF"/>
-          <w:sz w:val="16"/>
-          <w:szCs w:val="16"/>
-          <w:u w:val="single"/>
+          <w:sz w:val="20"/>
+          <w:szCs w:val="20"/>
         </w:rPr>
         <w:t xml:space="preserve">{ethnicity}</w:t>
       </w:r>
       <w:r>
-        <w:rPr>
-          <w:color w:val="0000FF"/>
-          <w:sz w:val="20"/>
-          <w:szCs w:val="20"/>
-        </w:rPr>
-        <w:t xml:space="preserve">  Tôn giáo: </w:t>
-      </w:r>
-      <w:r>
-        <w:rPr>
-          <w:color w:val="0000FF"/>
-          <w:sz w:val="16"/>
-          <w:szCs w:val="16"/>
-          <w:u w:val="single"/>
+        <w:tab/>
+      </w:r>
+      <w:r>
+        <w:rPr>
+          <w:color w:val="0000FF"/>
+          <w:sz w:val="20"/>
+          <w:szCs w:val="20"/>
+        </w:rPr>
+        <w:t xml:space="preserve">Tôn giáo: </w:t>
+      </w:r>
+      <w:r>
+        <w:rPr>
+          <w:color w:val="0000FF"/>
+          <w:sz w:val="20"/>
+          <w:szCs w:val="20"/>
         </w:rPr>
         <w:t xml:space="preserve">{religion}</w:t>
       </w:r>
       <w:r>
-        <w:rPr>
-          <w:color w:val="0000FF"/>
-          <w:sz w:val="20"/>
-          <w:szCs w:val="20"/>
-        </w:rPr>
-        <w:t xml:space="preserve">  Quốc tịch: </w:t>
-      </w:r>
-      <w:r>
-        <w:rPr>
-          <w:color w:val="0000FF"/>
-          <w:sz w:val="16"/>
-          <w:szCs w:val="16"/>
-          <w:u w:val="single"/>
+        <w:tab/>
+      </w:r>
+      <w:r>
+        <w:rPr>
+          <w:color w:val="0000FF"/>
+          <w:sz w:val="20"/>
+          <w:szCs w:val="20"/>
+        </w:rPr>
+        <w:t xml:space="preserve">Quốc tịch: </w:t>
+      </w:r>
+      <w:r>
+        <w:rPr>
+          <w:color w:val="0000FF"/>
+          <w:sz w:val="20"/>
+          <w:szCs w:val="20"/>
         </w:rPr>
         <w:t xml:space="preserve">{nationality}</w:t>
       </w:r>
-    </w:p>
-    <w:p>
-      <w:pPr>
-        <w:tabs>
-          <w:tab w:val="right" w:leader="dot" w:pos="4320"/>
+      <w:r>
+        <w:tab/>
+      </w:r>
+    </w:p>
+    <w:p>
+      <w:pPr>
+        <w:tabs>
+          <w:tab w:val="left" w:leader="dot" w:pos="3200"/>
+          <w:tab w:val="left" w:leader="dot" w:pos="6200"/>
           <w:tab w:val="left" w:leader="dot" w:pos="9072"/>
         </w:tabs>
         <w:spacing w:before="40" w:after="40" w:line="288" w:lineRule="auto"/>
@@ -726,51 +724,57 @@
       <w:r>
         <w:rPr>
           <w:color w:val="0000FF"/>
-          <w:sz w:val="16"/>
-          <w:szCs w:val="16"/>
-          <w:u w:val="single"/>
+          <w:sz w:val="20"/>
+          <w:szCs w:val="20"/>
         </w:rPr>
         <w:t xml:space="preserve">{citizen_id}</w:t>
       </w:r>
       <w:r>
-        <w:rPr>
-          <w:color w:val="0000FF"/>
-          <w:sz w:val="20"/>
-          <w:szCs w:val="20"/>
-        </w:rPr>
-        <w:t xml:space="preserve">  Ngày cấp: </w:t>
-      </w:r>
-      <w:r>
-        <w:rPr>
-          <w:color w:val="0000FF"/>
-          <w:sz w:val="16"/>
-          <w:szCs w:val="16"/>
-          <w:u w:val="single"/>
+        <w:tab/>
+      </w:r>
+      <w:r>
+        <w:rPr>
+          <w:color w:val="0000FF"/>
+          <w:sz w:val="20"/>
+          <w:szCs w:val="20"/>
+        </w:rPr>
+        <w:t xml:space="preserve">Ngày cấp: </w:t>
+      </w:r>
+      <w:r>
+        <w:rPr>
+          <w:color w:val="0000FF"/>
+          <w:sz w:val="20"/>
+          <w:szCs w:val="20"/>
         </w:rPr>
         <w:t xml:space="preserve">{citizen_id_issued_date}</w:t>
       </w:r>
       <w:r>
-        <w:rPr>
-          <w:color w:val="0000FF"/>
-          <w:sz w:val="20"/>
-          <w:szCs w:val="20"/>
-        </w:rPr>
-        <w:t xml:space="preserve">  Nơi cấp: </w:t>
-      </w:r>
-      <w:r>
-        <w:rPr>
-          <w:color w:val="0000FF"/>
-          <w:sz w:val="18"/>
-          <w:szCs w:val="18"/>
-          <w:u w:val="single"/>
+        <w:tab/>
+      </w:r>
+      <w:r>
+        <w:rPr>
+          <w:color w:val="0000FF"/>
+          <w:sz w:val="20"/>
+          <w:szCs w:val="20"/>
+        </w:rPr>
+        <w:t xml:space="preserve">Nơi cấp: </w:t>
+      </w:r>
+      <w:r>
+        <w:rPr>
+          <w:color w:val="0000FF"/>
+          <w:sz w:val="20"/>
+          <w:szCs w:val="20"/>
         </w:rPr>
         <w:t xml:space="preserve">{citizen_id_issued_place}</w:t>
       </w:r>
-    </w:p>
-    <w:p>
-      <w:pPr>
-        <w:tabs>
-          <w:tab w:val="right" w:leader="dot" w:pos="9072"/>
+      <w:r>
+        <w:tab/>
+      </w:r>
+    </w:p>
+    <w:p>
+      <w:pPr>
+        <w:tabs>
+          <w:tab w:val="left" w:leader="dot" w:pos="9072"/>
         </w:tabs>
         <w:spacing w:before="40" w:after="40" w:line="288" w:lineRule="auto"/>
         <w:ind w:left="426" w:hanging="142"/>
@@ -792,11 +796,13 @@
       <w:r>
         <w:rPr>
           <w:color w:val="0000FF"/>
-          <w:sz w:val="18"/>
-          <w:szCs w:val="18"/>
-          <w:u w:val="single"/>
+          <w:sz w:val="20"/>
+          <w:szCs w:val="20"/>
         </w:rPr>
         <w:t xml:space="preserve">{permanent_address}</w:t>
+      </w:r>
+      <w:r>
+        <w:tab/>
       </w:r>
     </w:p>
     <w:p>
@@ -832,7 +838,7 @@
     <w:p>
       <w:pPr>
         <w:tabs>
-          <w:tab w:val="right" w:leader="dot" w:pos="9072"/>
+          <w:tab w:val="left" w:leader="dot" w:pos="9072"/>
         </w:tabs>
         <w:spacing w:before="40" w:after="40" w:line="288" w:lineRule="auto"/>
         <w:ind w:left="426" w:hanging="142"/>
@@ -853,18 +859,20 @@
       <w:r>
         <w:rPr>
           <w:color w:val="0000FF"/>
-          <w:sz w:val="18"/>
-          <w:szCs w:val="18"/>
-          <w:u w:val="single"/>
+          <w:sz w:val="20"/>
+          <w:szCs w:val="20"/>
         </w:rPr>
         <w:t xml:space="preserve">{workplace}</w:t>
       </w:r>
-    </w:p>
-    <w:p>
-      <w:pPr>
-        <w:tabs>
-          <w:tab w:val="right" w:leader="dot" w:pos="9072"/>
-          <w:tab w:val="right" w:leader="dot" w:pos="9120"/>
+      <w:r>
+        <w:tab/>
+      </w:r>
+    </w:p>
+    <w:p>
+      <w:pPr>
+        <w:tabs>
+          <w:tab w:val="left" w:leader="dot" w:pos="3600"/>
+          <w:tab w:val="left" w:leader="dot" w:pos="9072"/>
         </w:tabs>
         <w:spacing w:before="40" w:after="40" w:line="288" w:lineRule="auto"/>
         <w:ind w:firstLine="284"/>
@@ -885,34 +893,38 @@
       <w:r>
         <w:rPr>
           <w:color w:val="0000FF"/>
-          <w:sz w:val="16"/>
-          <w:szCs w:val="16"/>
-          <w:u w:val="single"/>
+          <w:sz w:val="20"/>
+          <w:szCs w:val="20"/>
         </w:rPr>
         <w:t xml:space="preserve">{phone}</w:t>
       </w:r>
       <w:r>
-        <w:rPr>
-          <w:color w:val="0000FF"/>
-          <w:sz w:val="20"/>
-          <w:szCs w:val="20"/>
-        </w:rPr>
-        <w:t xml:space="preserve">    E-mail: </w:t>
-      </w:r>
-      <w:r>
-        <w:rPr>
-          <w:color w:val="0000FF"/>
-          <w:sz w:val="18"/>
-          <w:szCs w:val="18"/>
-          <w:u w:val="single"/>
+        <w:tab/>
+      </w:r>
+      <w:r>
+        <w:rPr>
+          <w:color w:val="0000FF"/>
+          <w:sz w:val="20"/>
+          <w:szCs w:val="20"/>
+        </w:rPr>
+        <w:t xml:space="preserve">E-mail: </w:t>
+      </w:r>
+      <w:r>
+        <w:rPr>
+          <w:color w:val="0000FF"/>
+          <w:sz w:val="20"/>
+          <w:szCs w:val="20"/>
         </w:rPr>
         <w:t xml:space="preserve">{email}</w:t>
       </w:r>
-    </w:p>
-    <w:p>
-      <w:pPr>
-        <w:tabs>
-          <w:tab w:val="right" w:leader="dot" w:pos="9072"/>
+      <w:r>
+        <w:tab/>
+      </w:r>
+    </w:p>
+    <w:p>
+      <w:pPr>
+        <w:tabs>
+          <w:tab w:val="left" w:leader="dot" w:pos="9072"/>
         </w:tabs>
         <w:spacing w:before="40" w:after="40" w:line="288" w:lineRule="auto"/>
         <w:ind w:firstLine="284"/>
@@ -933,11 +945,13 @@
       <w:r>
         <w:rPr>
           <w:color w:val="0000FF"/>
-          <w:sz w:val="18"/>
-          <w:szCs w:val="18"/>
-          <w:u w:val="single"/>
+          <w:sz w:val="20"/>
+          <w:szCs w:val="20"/>
         </w:rPr>
         <w:t xml:space="preserve">{contact_address}</w:t>
+      </w:r>
+      <w:r>
+        <w:tab/>
       </w:r>
     </w:p>
     <w:p>
@@ -965,7 +979,7 @@
     <w:p>
       <w:pPr>
         <w:tabs>
-          <w:tab w:val="right" w:leader="dot" w:pos="9072"/>
+          <w:tab w:val="left" w:leader="dot" w:pos="9072"/>
         </w:tabs>
         <w:spacing w:before="40" w:after="40" w:line="288" w:lineRule="auto"/>
         <w:ind w:left="426" w:hanging="142"/>
@@ -986,17 +1000,20 @@
       <w:r>
         <w:rPr>
           <w:color w:val="0000FF"/>
-          <w:sz w:val="16"/>
-          <w:szCs w:val="16"/>
-          <w:u w:val="single"/>
+          <w:sz w:val="20"/>
+          <w:szCs w:val="20"/>
         </w:rPr>
         <w:t xml:space="preserve">{admission_diploma}</w:t>
       </w:r>
-    </w:p>
-    <w:p>
-      <w:pPr>
-        <w:tabs>
-          <w:tab w:val="right" w:leader="dot" w:pos="9072"/>
+      <w:r>
+        <w:tab/>
+      </w:r>
+    </w:p>
+    <w:p>
+      <w:pPr>
+        <w:tabs>
+          <w:tab w:val="left" w:leader="dot" w:pos="5800"/>
+          <w:tab w:val="left" w:leader="dot" w:pos="9072"/>
         </w:tabs>
         <w:spacing w:before="40" w:after="40" w:line="288" w:lineRule="auto"/>
         <w:ind w:left="426" w:hanging="142"/>
@@ -1017,34 +1034,38 @@
       <w:r>
         <w:rPr>
           <w:color w:val="0000FF"/>
-          <w:sz w:val="18"/>
-          <w:szCs w:val="18"/>
-          <w:u w:val="single"/>
+          <w:sz w:val="20"/>
+          <w:szCs w:val="20"/>
         </w:rPr>
         <w:t xml:space="preserve">{graduate_major}</w:t>
       </w:r>
       <w:r>
-        <w:rPr>
-          <w:color w:val="0000FF"/>
-          <w:sz w:val="20"/>
-          <w:szCs w:val="20"/>
-        </w:rPr>
-        <w:t xml:space="preserve">    Năm tốt nghiệp: </w:t>
-      </w:r>
-      <w:r>
-        <w:rPr>
-          <w:color w:val="0000FF"/>
-          <w:sz w:val="16"/>
-          <w:szCs w:val="16"/>
-          <w:u w:val="single"/>
+        <w:tab/>
+      </w:r>
+      <w:r>
+        <w:rPr>
+          <w:color w:val="0000FF"/>
+          <w:sz w:val="20"/>
+          <w:szCs w:val="20"/>
+        </w:rPr>
+        <w:t xml:space="preserve">Năm tốt nghiệp: </w:t>
+      </w:r>
+      <w:r>
+        <w:rPr>
+          <w:color w:val="0000FF"/>
+          <w:sz w:val="20"/>
+          <w:szCs w:val="20"/>
         </w:rPr>
         <w:t xml:space="preserve">{graduation_year}</w:t>
       </w:r>
-    </w:p>
-    <w:p>
-      <w:pPr>
-        <w:tabs>
-          <w:tab w:val="right" w:leader="dot" w:pos="9072"/>
+      <w:r>
+        <w:tab/>
+      </w:r>
+    </w:p>
+    <w:p>
+      <w:pPr>
+        <w:tabs>
+          <w:tab w:val="left" w:leader="dot" w:pos="9072"/>
         </w:tabs>
         <w:spacing w:before="40" w:after="40" w:line="288" w:lineRule="auto"/>
         <w:ind w:left="426" w:hanging="142"/>
@@ -1065,17 +1086,20 @@
       <w:r>
         <w:rPr>
           <w:color w:val="0000FF"/>
-          <w:sz w:val="18"/>
-          <w:szCs w:val="18"/>
-          <w:u w:val="single"/>
+          <w:sz w:val="20"/>
+          <w:szCs w:val="20"/>
         </w:rPr>
         <w:t xml:space="preserve">{high_school_name}</w:t>
       </w:r>
-    </w:p>
-    <w:p>
-      <w:pPr>
-        <w:tabs>
-          <w:tab w:val="right" w:leader="dot" w:pos="9072"/>
+      <w:r>
+        <w:tab/>
+      </w:r>
+    </w:p>
+    <w:p>
+      <w:pPr>
+        <w:tabs>
+          <w:tab w:val="left" w:leader="dot" w:pos="5200"/>
+          <w:tab w:val="left" w:leader="dot" w:pos="9072"/>
         </w:tabs>
         <w:spacing w:before="40" w:after="40" w:line="288" w:lineRule="auto"/>
         <w:ind w:left="426" w:hanging="142"/>
@@ -1096,29 +1120,33 @@
       <w:r>
         <w:rPr>
           <w:color w:val="0000FF"/>
-          <w:sz w:val="18"/>
-          <w:szCs w:val="18"/>
-          <w:u w:val="single"/>
+          <w:sz w:val="20"/>
+          <w:szCs w:val="20"/>
         </w:rPr>
         <w:t xml:space="preserve">{high_school_ward}</w:t>
       </w:r>
       <w:r>
-        <w:rPr>
-          <w:color w:val="0000FF"/>
-          <w:sz w:val="20"/>
-          <w:szCs w:val="20"/>
-        </w:rPr>
-        <w:t xml:space="preserve">    Tỉnh/TP: </w:t>
-      </w:r>
-      <w:r>
-        <w:rPr>
-          <w:color w:val="0000FF"/>
-          <w:sz w:val="18"/>
-          <w:szCs w:val="18"/>
-          <w:u w:val="single"/>
+        <w:tab/>
+      </w:r>
+      <w:r>
+        <w:rPr>
+          <w:color w:val="0000FF"/>
+          <w:sz w:val="20"/>
+          <w:szCs w:val="20"/>
+        </w:rPr>
+        <w:t xml:space="preserve">Tỉnh/TP: </w:t>
+      </w:r>
+      <w:r>
+        <w:rPr>
+          <w:color w:val="0000FF"/>
+          <w:sz w:val="20"/>
+          <w:szCs w:val="20"/>
         </w:rPr>
         <w:t xml:space="preserve">{high_school_province}</w:t>
       </w:r>
+      <w:r>
+        <w:tab/>
+      </w:r>
     </w:p>
     <w:p>
       <w:pPr>
@@ -1155,7 +1183,7 @@
     <w:p>
       <w:pPr>
         <w:tabs>
-          <w:tab w:val="left" w:pos="5670"/>
+          <w:tab w:val="left" w:leader="dot" w:pos="5670"/>
           <w:tab w:val="left" w:leader="dot" w:pos="9072"/>
         </w:tabs>
         <w:spacing w:before="40" w:after="40" w:line="288" w:lineRule="auto"/>
@@ -1178,28 +1206,32 @@
       <w:r>
         <w:rPr>
           <w:color w:val="0000FF"/>
-          <w:sz w:val="18"/>
-          <w:szCs w:val="18"/>
-          <w:u w:val="single"/>
+          <w:sz w:val="20"/>
+          <w:szCs w:val="20"/>
         </w:rPr>
         <w:t xml:space="preserve">{relative_1_full_name}</w:t>
       </w:r>
       <w:r>
-        <w:rPr>
-          <w:color w:val="0000FF"/>
-          <w:sz w:val="20"/>
-          <w:szCs w:val="20"/>
-        </w:rPr>
-        <w:t xml:space="preserve">    Quan hệ: </w:t>
-      </w:r>
-      <w:r>
-        <w:rPr>
-          <w:color w:val="0000FF"/>
-          <w:sz w:val="18"/>
-          <w:szCs w:val="18"/>
-          <w:u w:val="single"/>
+        <w:tab/>
+      </w:r>
+      <w:r>
+        <w:rPr>
+          <w:color w:val="0000FF"/>
+          <w:sz w:val="20"/>
+          <w:szCs w:val="20"/>
+        </w:rPr>
+        <w:t xml:space="preserve">Quan hệ: </w:t>
+      </w:r>
+      <w:r>
+        <w:rPr>
+          <w:color w:val="0000FF"/>
+          <w:sz w:val="20"/>
+          <w:szCs w:val="20"/>
         </w:rPr>
         <w:t xml:space="preserve">{relative_1_relationship}</w:t>
+      </w:r>
+      <w:r>
+        <w:tab/>
       </w:r>
     </w:p>
     <w:p>
@@ -1228,28 +1260,32 @@
       <w:r>
         <w:rPr>
           <w:color w:val="0000FF"/>
-          <w:sz w:val="18"/>
-          <w:szCs w:val="18"/>
-          <w:u w:val="single"/>
+          <w:sz w:val="20"/>
+          <w:szCs w:val="20"/>
         </w:rPr>
         <w:t xml:space="preserve">{relative_1_occupation}</w:t>
       </w:r>
       <w:r>
-        <w:rPr>
-          <w:color w:val="0000FF"/>
-          <w:sz w:val="20"/>
-          <w:szCs w:val="20"/>
-        </w:rPr>
-        <w:t xml:space="preserve">    Điện thoại: </w:t>
-      </w:r>
-      <w:r>
-        <w:rPr>
-          <w:color w:val="0000FF"/>
-          <w:sz w:val="18"/>
-          <w:szCs w:val="18"/>
-          <w:u w:val="single"/>
+        <w:tab/>
+      </w:r>
+      <w:r>
+        <w:rPr>
+          <w:color w:val="0000FF"/>
+          <w:sz w:val="20"/>
+          <w:szCs w:val="20"/>
+        </w:rPr>
+        <w:t xml:space="preserve">Điện thoại: </w:t>
+      </w:r>
+      <w:r>
+        <w:rPr>
+          <w:color w:val="0000FF"/>
+          <w:sz w:val="20"/>
+          <w:szCs w:val="20"/>
         </w:rPr>
         <w:t xml:space="preserve">{relative_1_phone}</w:t>
+      </w:r>
+      <w:r>
+        <w:tab/>
       </w:r>
     </w:p>
     <w:p>
@@ -1277,17 +1313,19 @@
       <w:r>
         <w:rPr>
           <w:color w:val="0000FF"/>
-          <w:sz w:val="18"/>
-          <w:szCs w:val="18"/>
-          <w:u w:val="single"/>
+          <w:sz w:val="20"/>
+          <w:szCs w:val="20"/>
         </w:rPr>
         <w:t xml:space="preserve">{relative_1_address}</w:t>
       </w:r>
-    </w:p>
-    <w:p>
-      <w:pPr>
-        <w:tabs>
-          <w:tab w:val="left" w:pos="5670"/>
+      <w:r>
+        <w:tab/>
+      </w:r>
+    </w:p>
+    <w:p>
+      <w:pPr>
+        <w:tabs>
+          <w:tab w:val="left" w:leader="dot" w:pos="5670"/>
           <w:tab w:val="left" w:leader="dot" w:pos="9072"/>
         </w:tabs>
         <w:spacing w:before="40" w:after="40" w:line="288" w:lineRule="auto"/>
@@ -1310,28 +1348,32 @@
       <w:r>
         <w:rPr>
           <w:color w:val="0000FF"/>
-          <w:sz w:val="18"/>
-          <w:szCs w:val="18"/>
-          <w:u w:val="single"/>
+          <w:sz w:val="20"/>
+          <w:szCs w:val="20"/>
         </w:rPr>
         <w:t xml:space="preserve">{relative_2_full_name}</w:t>
       </w:r>
       <w:r>
-        <w:rPr>
-          <w:color w:val="0000FF"/>
-          <w:sz w:val="20"/>
-          <w:szCs w:val="20"/>
-        </w:rPr>
-        <w:t xml:space="preserve">    Quan hệ: </w:t>
-      </w:r>
-      <w:r>
-        <w:rPr>
-          <w:color w:val="0000FF"/>
-          <w:sz w:val="18"/>
-          <w:szCs w:val="18"/>
-          <w:u w:val="single"/>
+        <w:tab/>
+      </w:r>
+      <w:r>
+        <w:rPr>
+          <w:color w:val="0000FF"/>
+          <w:sz w:val="20"/>
+          <w:szCs w:val="20"/>
+        </w:rPr>
+        <w:t xml:space="preserve">Quan hệ: </w:t>
+      </w:r>
+      <w:r>
+        <w:rPr>
+          <w:color w:val="0000FF"/>
+          <w:sz w:val="20"/>
+          <w:szCs w:val="20"/>
         </w:rPr>
         <w:t xml:space="preserve">{relative_2_relationship}</w:t>
+      </w:r>
+      <w:r>
+        <w:tab/>
       </w:r>
     </w:p>
     <w:p>
@@ -1360,28 +1402,32 @@
       <w:r>
         <w:rPr>
           <w:color w:val="0000FF"/>
-          <w:sz w:val="18"/>
-          <w:szCs w:val="18"/>
-          <w:u w:val="single"/>
+          <w:sz w:val="20"/>
+          <w:szCs w:val="20"/>
         </w:rPr>
         <w:t xml:space="preserve">{relative_2_occupation}</w:t>
       </w:r>
       <w:r>
-        <w:rPr>
-          <w:color w:val="0000FF"/>
-          <w:sz w:val="20"/>
-          <w:szCs w:val="20"/>
-        </w:rPr>
-        <w:t xml:space="preserve">    Điện thoại: </w:t>
-      </w:r>
-      <w:r>
-        <w:rPr>
-          <w:color w:val="0000FF"/>
-          <w:sz w:val="18"/>
-          <w:szCs w:val="18"/>
-          <w:u w:val="single"/>
+        <w:tab/>
+      </w:r>
+      <w:r>
+        <w:rPr>
+          <w:color w:val="0000FF"/>
+          <w:sz w:val="20"/>
+          <w:szCs w:val="20"/>
+        </w:rPr>
+        <w:t xml:space="preserve">Điện thoại: </w:t>
+      </w:r>
+      <w:r>
+        <w:rPr>
+          <w:color w:val="0000FF"/>
+          <w:sz w:val="20"/>
+          <w:szCs w:val="20"/>
         </w:rPr>
         <w:t xml:space="preserve">{relative_2_phone}</w:t>
+      </w:r>
+      <w:r>
+        <w:tab/>
       </w:r>
     </w:p>
     <w:p>
@@ -1409,11 +1455,13 @@
       <w:r>
         <w:rPr>
           <w:color w:val="0000FF"/>
-          <w:sz w:val="18"/>
-          <w:szCs w:val="18"/>
-          <w:u w:val="single"/>
+          <w:sz w:val="20"/>
+          <w:szCs w:val="20"/>
         </w:rPr>
         <w:t xml:space="preserve">{relative_2_address}</w:t>
+      </w:r>
+      <w:r>
+        <w:tab/>
       </w:r>
     </w:p>
     <w:p>

</xml_diff>

<commit_message>
Prepare production deployment on Render
</commit_message>
<xml_diff>
--- a/src/modules/word-export/templates/phieu-du-tuyen-v1.docx
+++ b/src/modules/word-export/templates/phieu-du-tuyen-v1.docx
@@ -80,7 +80,7 @@
               <w:rPr>
                 <w:b/>
                 <w:color w:val="FF0000"/>
-                <w:sz w:val="20"/>
+                <w:sz w:val="26"/>
               </w:rPr>
               <w:t xml:space="preserve">  </w:t>
             </w:r>
@@ -88,7 +88,7 @@
               <w:rPr>
                 <w:b/>
                 <w:color w:val="FF0000"/>
-                <w:sz w:val="20"/>
+                <w:sz w:val="26"/>
               </w:rPr>
               <w:t>ISO 9001:20</w:t>
             </w:r>
@@ -96,7 +96,7 @@
               <w:rPr>
                 <w:b/>
                 <w:color w:val="FF0000"/>
-                <w:sz w:val="20"/>
+                <w:sz w:val="26"/>
               </w:rPr>
               <w:t>15</w:t>
             </w:r>
@@ -419,16 +419,16 @@
       <w:r>
         <w:rPr>
           <w:color w:val="FF0000"/>
-          <w:sz w:val="28"/>
-          <w:szCs w:val="28"/>
+          <w:sz w:val="26"/>
+          <w:szCs w:val="26"/>
         </w:rPr>
         <w:t xml:space="preserve">Ngành: </w:t>
       </w:r>
       <w:r>
         <w:rPr>
           <w:color w:val="FF0000"/>
-          <w:sz w:val="20"/>
-          <w:szCs w:val="20"/>
+          <w:sz w:val="26"/>
+          <w:szCs w:val="26"/>
         </w:rPr>
         <w:t xml:space="preserve">{major_name}</w:t>
       </w:r>
@@ -460,10 +460,10 @@
       <w:r>
         <w:rPr>
           <w:color w:val="FF0000"/>
-          <w:sz w:val="20"/>
-          <w:szCs w:val="20"/>
-        </w:rPr>
-        <w:t xml:space="preserve">Đối tượng: từ (THPT/TC/CĐ/ĐH).....................học lên Đại học</w:t>
+          <w:sz w:val="26"/>
+          <w:szCs w:val="26"/>
+        </w:rPr>
+        <w:t xml:space="preserve">{entry_qualification_line}</w:t>
       </w:r>
     </w:p>
     <w:p>
@@ -536,16 +536,16 @@
       <w:r>
         <w:rPr>
           <w:color w:val="0000FF"/>
-          <w:sz w:val="20"/>
-          <w:szCs w:val="20"/>
+          <w:sz w:val="26"/>
+          <w:szCs w:val="26"/>
         </w:rPr>
         <w:t xml:space="preserve"> Họ và tên khai sinh: </w:t>
       </w:r>
       <w:r>
         <w:rPr>
           <w:color w:val="0000FF"/>
-          <w:sz w:val="20"/>
-          <w:szCs w:val="20"/>
+          <w:sz w:val="26"/>
+          <w:szCs w:val="26"/>
         </w:rPr>
         <w:t xml:space="preserve">{full_name}</w:t>
       </w:r>
@@ -555,16 +555,16 @@
       <w:r>
         <w:rPr>
           <w:color w:val="0000FF"/>
-          <w:sz w:val="20"/>
-          <w:szCs w:val="20"/>
+          <w:sz w:val="26"/>
+          <w:szCs w:val="26"/>
         </w:rPr>
         <w:t xml:space="preserve">Giới tính: </w:t>
       </w:r>
       <w:r>
         <w:rPr>
           <w:color w:val="0000FF"/>
-          <w:sz w:val="20"/>
-          <w:szCs w:val="20"/>
+          <w:sz w:val="26"/>
+          <w:szCs w:val="26"/>
         </w:rPr>
         <w:t xml:space="preserve">{gender}</w:t>
       </w:r>
@@ -589,16 +589,16 @@
       <w:r>
         <w:rPr>
           <w:color w:val="0000FF"/>
-          <w:sz w:val="20"/>
-          <w:szCs w:val="20"/>
+          <w:sz w:val="26"/>
+          <w:szCs w:val="26"/>
         </w:rPr>
         <w:t xml:space="preserve"> Ngày sinh: </w:t>
       </w:r>
       <w:r>
         <w:rPr>
           <w:color w:val="0000FF"/>
-          <w:sz w:val="20"/>
-          <w:szCs w:val="20"/>
+          <w:sz w:val="26"/>
+          <w:szCs w:val="26"/>
         </w:rPr>
         <w:t xml:space="preserve">{date_of_birth}</w:t>
       </w:r>
@@ -608,16 +608,16 @@
       <w:r>
         <w:rPr>
           <w:color w:val="0000FF"/>
-          <w:sz w:val="20"/>
-          <w:szCs w:val="20"/>
+          <w:sz w:val="26"/>
+          <w:szCs w:val="26"/>
         </w:rPr>
         <w:t xml:space="preserve">Nơi sinh: </w:t>
       </w:r>
       <w:r>
         <w:rPr>
           <w:color w:val="0000FF"/>
-          <w:sz w:val="20"/>
-          <w:szCs w:val="20"/>
+          <w:sz w:val="26"/>
+          <w:szCs w:val="26"/>
         </w:rPr>
         <w:t xml:space="preserve">{place_of_birth}</w:t>
       </w:r>
@@ -643,16 +643,16 @@
       <w:r>
         <w:rPr>
           <w:color w:val="0000FF"/>
-          <w:sz w:val="20"/>
-          <w:szCs w:val="20"/>
+          <w:sz w:val="26"/>
+          <w:szCs w:val="26"/>
         </w:rPr>
         <w:t xml:space="preserve"> Dân tộc: </w:t>
       </w:r>
       <w:r>
         <w:rPr>
           <w:color w:val="0000FF"/>
-          <w:sz w:val="20"/>
-          <w:szCs w:val="20"/>
+          <w:sz w:val="26"/>
+          <w:szCs w:val="26"/>
         </w:rPr>
         <w:t xml:space="preserve">{ethnicity}</w:t>
       </w:r>
@@ -662,16 +662,16 @@
       <w:r>
         <w:rPr>
           <w:color w:val="0000FF"/>
-          <w:sz w:val="20"/>
-          <w:szCs w:val="20"/>
+          <w:sz w:val="26"/>
+          <w:szCs w:val="26"/>
         </w:rPr>
         <w:t xml:space="preserve">Tôn giáo: </w:t>
       </w:r>
       <w:r>
         <w:rPr>
           <w:color w:val="0000FF"/>
-          <w:sz w:val="20"/>
-          <w:szCs w:val="20"/>
+          <w:sz w:val="26"/>
+          <w:szCs w:val="26"/>
         </w:rPr>
         <w:t xml:space="preserve">{religion}</w:t>
       </w:r>
@@ -681,16 +681,16 @@
       <w:r>
         <w:rPr>
           <w:color w:val="0000FF"/>
-          <w:sz w:val="20"/>
-          <w:szCs w:val="20"/>
+          <w:sz w:val="26"/>
+          <w:szCs w:val="26"/>
         </w:rPr>
         <w:t xml:space="preserve">Quốc tịch: </w:t>
       </w:r>
       <w:r>
         <w:rPr>
           <w:color w:val="0000FF"/>
-          <w:sz w:val="20"/>
-          <w:szCs w:val="20"/>
+          <w:sz w:val="26"/>
+          <w:szCs w:val="26"/>
         </w:rPr>
         <w:t xml:space="preserve">{nationality}</w:t>
       </w:r>
@@ -716,16 +716,16 @@
       <w:r>
         <w:rPr>
           <w:color w:val="0000FF"/>
-          <w:sz w:val="20"/>
-          <w:szCs w:val="20"/>
+          <w:sz w:val="26"/>
+          <w:szCs w:val="26"/>
         </w:rPr>
         <w:t xml:space="preserve"> Số CCCD: </w:t>
       </w:r>
       <w:r>
         <w:rPr>
           <w:color w:val="0000FF"/>
-          <w:sz w:val="20"/>
-          <w:szCs w:val="20"/>
+          <w:sz w:val="26"/>
+          <w:szCs w:val="26"/>
         </w:rPr>
         <w:t xml:space="preserve">{citizen_id}</w:t>
       </w:r>
@@ -735,16 +735,16 @@
       <w:r>
         <w:rPr>
           <w:color w:val="0000FF"/>
-          <w:sz w:val="20"/>
-          <w:szCs w:val="20"/>
+          <w:sz w:val="26"/>
+          <w:szCs w:val="26"/>
         </w:rPr>
         <w:t xml:space="preserve">Ngày cấp: </w:t>
       </w:r>
       <w:r>
         <w:rPr>
           <w:color w:val="0000FF"/>
-          <w:sz w:val="20"/>
-          <w:szCs w:val="20"/>
+          <w:sz w:val="26"/>
+          <w:szCs w:val="26"/>
         </w:rPr>
         <w:t xml:space="preserve">{citizen_id_issued_date}</w:t>
       </w:r>
@@ -754,16 +754,16 @@
       <w:r>
         <w:rPr>
           <w:color w:val="0000FF"/>
-          <w:sz w:val="20"/>
-          <w:szCs w:val="20"/>
+          <w:sz w:val="26"/>
+          <w:szCs w:val="26"/>
         </w:rPr>
         <w:t xml:space="preserve">Nơi cấp: </w:t>
       </w:r>
       <w:r>
         <w:rPr>
           <w:color w:val="0000FF"/>
-          <w:sz w:val="20"/>
-          <w:szCs w:val="20"/>
+          <w:sz w:val="26"/>
+          <w:szCs w:val="26"/>
         </w:rPr>
         <w:t xml:space="preserve">{citizen_id_issued_place}</w:t>
       </w:r>
@@ -788,16 +788,16 @@
       <w:r>
         <w:rPr>
           <w:color w:val="0000FF"/>
-          <w:sz w:val="20"/>
-          <w:szCs w:val="20"/>
+          <w:sz w:val="26"/>
+          <w:szCs w:val="26"/>
         </w:rPr>
         <w:t xml:space="preserve"> Nơi thường trú: </w:t>
       </w:r>
       <w:r>
         <w:rPr>
           <w:color w:val="0000FF"/>
-          <w:sz w:val="20"/>
-          <w:szCs w:val="20"/>
+          <w:sz w:val="26"/>
+          <w:szCs w:val="26"/>
         </w:rPr>
         <w:t xml:space="preserve">{permanent_address}</w:t>
       </w:r>
@@ -851,16 +851,16 @@
       <w:r>
         <w:rPr>
           <w:color w:val="0000FF"/>
-          <w:sz w:val="20"/>
-          <w:szCs w:val="20"/>
+          <w:sz w:val="26"/>
+          <w:szCs w:val="26"/>
         </w:rPr>
         <w:t xml:space="preserve"> Công việc/ Đơn vị công tác: </w:t>
       </w:r>
       <w:r>
         <w:rPr>
           <w:color w:val="0000FF"/>
-          <w:sz w:val="20"/>
-          <w:szCs w:val="20"/>
+          <w:sz w:val="26"/>
+          <w:szCs w:val="26"/>
         </w:rPr>
         <w:t xml:space="preserve">{workplace}</w:t>
       </w:r>
@@ -885,16 +885,16 @@
       <w:r>
         <w:rPr>
           <w:color w:val="0000FF"/>
-          <w:sz w:val="20"/>
-          <w:szCs w:val="20"/>
+          <w:sz w:val="26"/>
+          <w:szCs w:val="26"/>
         </w:rPr>
         <w:t xml:space="preserve"> Điện thoại: </w:t>
       </w:r>
       <w:r>
         <w:rPr>
           <w:color w:val="0000FF"/>
-          <w:sz w:val="20"/>
-          <w:szCs w:val="20"/>
+          <w:sz w:val="26"/>
+          <w:szCs w:val="26"/>
         </w:rPr>
         <w:t xml:space="preserve">{phone}</w:t>
       </w:r>
@@ -904,16 +904,16 @@
       <w:r>
         <w:rPr>
           <w:color w:val="0000FF"/>
-          <w:sz w:val="20"/>
-          <w:szCs w:val="20"/>
+          <w:sz w:val="26"/>
+          <w:szCs w:val="26"/>
         </w:rPr>
         <w:t xml:space="preserve">E-mail: </w:t>
       </w:r>
       <w:r>
         <w:rPr>
           <w:color w:val="0000FF"/>
-          <w:sz w:val="20"/>
-          <w:szCs w:val="20"/>
+          <w:sz w:val="26"/>
+          <w:szCs w:val="26"/>
         </w:rPr>
         <w:t xml:space="preserve">{email}</w:t>
       </w:r>
@@ -937,16 +937,16 @@
       <w:r>
         <w:rPr>
           <w:color w:val="0000FF"/>
-          <w:sz w:val="20"/>
-          <w:szCs w:val="20"/>
+          <w:sz w:val="26"/>
+          <w:szCs w:val="26"/>
         </w:rPr>
         <w:t xml:space="preserve"> Địa chỉ liên hệ: </w:t>
       </w:r>
       <w:r>
         <w:rPr>
           <w:color w:val="0000FF"/>
-          <w:sz w:val="20"/>
-          <w:szCs w:val="20"/>
+          <w:sz w:val="26"/>
+          <w:szCs w:val="26"/>
         </w:rPr>
         <w:t xml:space="preserve">{contact_address}</w:t>
       </w:r>
@@ -992,16 +992,16 @@
       <w:r>
         <w:rPr>
           <w:color w:val="0000FF"/>
-          <w:sz w:val="20"/>
-          <w:szCs w:val="20"/>
+          <w:sz w:val="26"/>
+          <w:szCs w:val="26"/>
         </w:rPr>
         <w:t xml:space="preserve"> Bằng tốt nghiệp sử dụng đăng ký xét tuyển (THPT/TC/CĐ/ĐH): </w:t>
       </w:r>
       <w:r>
         <w:rPr>
           <w:color w:val="0000FF"/>
-          <w:sz w:val="20"/>
-          <w:szCs w:val="20"/>
+          <w:sz w:val="26"/>
+          <w:szCs w:val="26"/>
         </w:rPr>
         <w:t xml:space="preserve">{admission_diploma}</w:t>
       </w:r>
@@ -1026,16 +1026,16 @@
       <w:r>
         <w:rPr>
           <w:color w:val="0000FF"/>
-          <w:sz w:val="20"/>
-          <w:szCs w:val="20"/>
+          <w:sz w:val="26"/>
+          <w:szCs w:val="26"/>
         </w:rPr>
         <w:t xml:space="preserve"> Ngành tốt nghiệp: </w:t>
       </w:r>
       <w:r>
         <w:rPr>
           <w:color w:val="0000FF"/>
-          <w:sz w:val="20"/>
-          <w:szCs w:val="20"/>
+          <w:sz w:val="26"/>
+          <w:szCs w:val="26"/>
         </w:rPr>
         <w:t xml:space="preserve">{graduate_major}</w:t>
       </w:r>
@@ -1045,16 +1045,16 @@
       <w:r>
         <w:rPr>
           <w:color w:val="0000FF"/>
-          <w:sz w:val="20"/>
-          <w:szCs w:val="20"/>
+          <w:sz w:val="26"/>
+          <w:szCs w:val="26"/>
         </w:rPr>
         <w:t xml:space="preserve">Năm tốt nghiệp: </w:t>
       </w:r>
       <w:r>
         <w:rPr>
           <w:color w:val="0000FF"/>
-          <w:sz w:val="20"/>
-          <w:szCs w:val="20"/>
+          <w:sz w:val="26"/>
+          <w:szCs w:val="26"/>
         </w:rPr>
         <w:t xml:space="preserve">{graduation_year}</w:t>
       </w:r>
@@ -1078,16 +1078,16 @@
       <w:r>
         <w:rPr>
           <w:color w:val="0000FF"/>
-          <w:sz w:val="20"/>
-          <w:szCs w:val="20"/>
+          <w:sz w:val="26"/>
+          <w:szCs w:val="26"/>
         </w:rPr>
         <w:t xml:space="preserve"> Nơi học lớp 12 bậc THPT - Tên trường: </w:t>
       </w:r>
       <w:r>
         <w:rPr>
           <w:color w:val="0000FF"/>
-          <w:sz w:val="20"/>
-          <w:szCs w:val="20"/>
+          <w:sz w:val="26"/>
+          <w:szCs w:val="26"/>
         </w:rPr>
         <w:t xml:space="preserve">{high_school_name}</w:t>
       </w:r>
@@ -1112,16 +1112,16 @@
       <w:r>
         <w:rPr>
           <w:color w:val="0000FF"/>
-          <w:sz w:val="20"/>
-          <w:szCs w:val="20"/>
+          <w:sz w:val="26"/>
+          <w:szCs w:val="26"/>
         </w:rPr>
         <w:t xml:space="preserve"> Tại xã/Phường: </w:t>
       </w:r>
       <w:r>
         <w:rPr>
           <w:color w:val="0000FF"/>
-          <w:sz w:val="20"/>
-          <w:szCs w:val="20"/>
+          <w:sz w:val="26"/>
+          <w:szCs w:val="26"/>
         </w:rPr>
         <w:t xml:space="preserve">{high_school_ward}</w:t>
       </w:r>
@@ -1131,16 +1131,16 @@
       <w:r>
         <w:rPr>
           <w:color w:val="0000FF"/>
-          <w:sz w:val="20"/>
-          <w:szCs w:val="20"/>
+          <w:sz w:val="26"/>
+          <w:szCs w:val="26"/>
         </w:rPr>
         <w:t xml:space="preserve">Tỉnh/TP: </w:t>
       </w:r>
       <w:r>
         <w:rPr>
           <w:color w:val="0000FF"/>
-          <w:sz w:val="20"/>
-          <w:szCs w:val="20"/>
+          <w:sz w:val="26"/>
+          <w:szCs w:val="26"/>
         </w:rPr>
         <w:t xml:space="preserve">{high_school_province}</w:t>
       </w:r>
@@ -1198,16 +1198,16 @@
       <w:r>
         <w:rPr>
           <w:color w:val="0000FF"/>
-          <w:sz w:val="20"/>
-          <w:szCs w:val="20"/>
+          <w:sz w:val="26"/>
+          <w:szCs w:val="26"/>
         </w:rPr>
         <w:t xml:space="preserve">Họ và tên: </w:t>
       </w:r>
       <w:r>
         <w:rPr>
           <w:color w:val="0000FF"/>
-          <w:sz w:val="20"/>
-          <w:szCs w:val="20"/>
+          <w:sz w:val="26"/>
+          <w:szCs w:val="26"/>
         </w:rPr>
         <w:t xml:space="preserve">{relative_1_full_name}</w:t>
       </w:r>
@@ -1217,16 +1217,16 @@
       <w:r>
         <w:rPr>
           <w:color w:val="0000FF"/>
-          <w:sz w:val="20"/>
-          <w:szCs w:val="20"/>
+          <w:sz w:val="26"/>
+          <w:szCs w:val="26"/>
         </w:rPr>
         <w:t xml:space="preserve">Quan hệ: </w:t>
       </w:r>
       <w:r>
         <w:rPr>
           <w:color w:val="0000FF"/>
-          <w:sz w:val="20"/>
-          <w:szCs w:val="20"/>
+          <w:sz w:val="26"/>
+          <w:szCs w:val="26"/>
         </w:rPr>
         <w:t xml:space="preserve">{relative_1_relationship}</w:t>
       </w:r>
@@ -1252,16 +1252,16 @@
       <w:r>
         <w:rPr>
           <w:color w:val="0000FF"/>
-          <w:sz w:val="20"/>
-          <w:szCs w:val="20"/>
+          <w:sz w:val="26"/>
+          <w:szCs w:val="26"/>
         </w:rPr>
         <w:t xml:space="preserve">Nghề nghiệp: </w:t>
       </w:r>
       <w:r>
         <w:rPr>
           <w:color w:val="0000FF"/>
-          <w:sz w:val="20"/>
-          <w:szCs w:val="20"/>
+          <w:sz w:val="26"/>
+          <w:szCs w:val="26"/>
         </w:rPr>
         <w:t xml:space="preserve">{relative_1_occupation}</w:t>
       </w:r>
@@ -1271,16 +1271,16 @@
       <w:r>
         <w:rPr>
           <w:color w:val="0000FF"/>
-          <w:sz w:val="20"/>
-          <w:szCs w:val="20"/>
+          <w:sz w:val="26"/>
+          <w:szCs w:val="26"/>
         </w:rPr>
         <w:t xml:space="preserve">Điện thoại: </w:t>
       </w:r>
       <w:r>
         <w:rPr>
           <w:color w:val="0000FF"/>
-          <w:sz w:val="20"/>
-          <w:szCs w:val="20"/>
+          <w:sz w:val="26"/>
+          <w:szCs w:val="26"/>
         </w:rPr>
         <w:t xml:space="preserve">{relative_1_phone}</w:t>
       </w:r>
@@ -1305,16 +1305,16 @@
       <w:r>
         <w:rPr>
           <w:color w:val="0000FF"/>
-          <w:sz w:val="20"/>
-          <w:szCs w:val="20"/>
+          <w:sz w:val="26"/>
+          <w:szCs w:val="26"/>
         </w:rPr>
         <w:t xml:space="preserve">Địa chỉ: </w:t>
       </w:r>
       <w:r>
         <w:rPr>
           <w:color w:val="0000FF"/>
-          <w:sz w:val="20"/>
-          <w:szCs w:val="20"/>
+          <w:sz w:val="26"/>
+          <w:szCs w:val="26"/>
         </w:rPr>
         <w:t xml:space="preserve">{relative_1_address}</w:t>
       </w:r>
@@ -1340,16 +1340,16 @@
       <w:r>
         <w:rPr>
           <w:color w:val="0000FF"/>
-          <w:sz w:val="20"/>
-          <w:szCs w:val="20"/>
+          <w:sz w:val="26"/>
+          <w:szCs w:val="26"/>
         </w:rPr>
         <w:t xml:space="preserve">Họ và tên: </w:t>
       </w:r>
       <w:r>
         <w:rPr>
           <w:color w:val="0000FF"/>
-          <w:sz w:val="20"/>
-          <w:szCs w:val="20"/>
+          <w:sz w:val="26"/>
+          <w:szCs w:val="26"/>
         </w:rPr>
         <w:t xml:space="preserve">{relative_2_full_name}</w:t>
       </w:r>
@@ -1359,16 +1359,16 @@
       <w:r>
         <w:rPr>
           <w:color w:val="0000FF"/>
-          <w:sz w:val="20"/>
-          <w:szCs w:val="20"/>
+          <w:sz w:val="26"/>
+          <w:szCs w:val="26"/>
         </w:rPr>
         <w:t xml:space="preserve">Quan hệ: </w:t>
       </w:r>
       <w:r>
         <w:rPr>
           <w:color w:val="0000FF"/>
-          <w:sz w:val="20"/>
-          <w:szCs w:val="20"/>
+          <w:sz w:val="26"/>
+          <w:szCs w:val="26"/>
         </w:rPr>
         <w:t xml:space="preserve">{relative_2_relationship}</w:t>
       </w:r>
@@ -1394,16 +1394,16 @@
       <w:r>
         <w:rPr>
           <w:color w:val="0000FF"/>
-          <w:sz w:val="20"/>
-          <w:szCs w:val="20"/>
+          <w:sz w:val="26"/>
+          <w:szCs w:val="26"/>
         </w:rPr>
         <w:t xml:space="preserve">Nghề nghiệp: </w:t>
       </w:r>
       <w:r>
         <w:rPr>
           <w:color w:val="0000FF"/>
-          <w:sz w:val="20"/>
-          <w:szCs w:val="20"/>
+          <w:sz w:val="26"/>
+          <w:szCs w:val="26"/>
         </w:rPr>
         <w:t xml:space="preserve">{relative_2_occupation}</w:t>
       </w:r>
@@ -1413,16 +1413,16 @@
       <w:r>
         <w:rPr>
           <w:color w:val="0000FF"/>
-          <w:sz w:val="20"/>
-          <w:szCs w:val="20"/>
+          <w:sz w:val="26"/>
+          <w:szCs w:val="26"/>
         </w:rPr>
         <w:t xml:space="preserve">Điện thoại: </w:t>
       </w:r>
       <w:r>
         <w:rPr>
           <w:color w:val="0000FF"/>
-          <w:sz w:val="20"/>
-          <w:szCs w:val="20"/>
+          <w:sz w:val="26"/>
+          <w:szCs w:val="26"/>
         </w:rPr>
         <w:t xml:space="preserve">{relative_2_phone}</w:t>
       </w:r>
@@ -1447,16 +1447,16 @@
       <w:r>
         <w:rPr>
           <w:color w:val="0000FF"/>
-          <w:sz w:val="20"/>
-          <w:szCs w:val="20"/>
+          <w:sz w:val="26"/>
+          <w:szCs w:val="26"/>
         </w:rPr>
         <w:t xml:space="preserve">Địa chỉ: </w:t>
       </w:r>
       <w:r>
         <w:rPr>
           <w:color w:val="0000FF"/>
-          <w:sz w:val="20"/>
-          <w:szCs w:val="20"/>
+          <w:sz w:val="26"/>
+          <w:szCs w:val="26"/>
         </w:rPr>
         <w:t xml:space="preserve">{relative_2_address}</w:t>
       </w:r>
@@ -1501,8 +1501,8 @@
       <w:r>
         <w:rPr>
           <w:color w:val="0000FF"/>
-          <w:sz w:val="20"/>
-          <w:szCs w:val="20"/>
+          <w:sz w:val="26"/>
+          <w:szCs w:val="26"/>
         </w:rPr>
         <w:t xml:space="preserve">          </w:t>
       </w:r>
@@ -1510,8 +1510,8 @@
         <w:rPr>
           <w:i/>
           <w:color w:val="0000FF"/>
-          <w:sz w:val="20"/>
-          <w:szCs w:val="20"/>
+          <w:sz w:val="26"/>
+          <w:szCs w:val="26"/>
         </w:rPr>
         <w:t xml:space="preserve">{declaration_place}, ngày {declaration_day} tháng {declaration_month} năm {declaration_year}</w:t>
       </w:r>

</xml_diff>